<commit_message>
Record the author's ORCID and the published data DOI.
The data record is live at 10.5281/zenodo.23536810 (CC BY 4.0), so the
manuscript's Data availability statement names it and the licence, and the
ORCID 0000-0003-2487-0636 is in the byline, .zenodo.json, CITATION.cff and
the dataset metadata. The Word file, PDF and submission package are rebuilt.
The software DOI waits on the v0.1.0 GitHub release.

Co-Authored-By: Claude Fable 5.1 <noreply@anthropic.com>
</commit_message>
<xml_diff>
--- a/paper/deliverables/Conformome_ORE_manuscript_NA_2.docx
+++ b/paper/deliverables/Conformome_ORE_manuscript_NA_2.docx
@@ -27,7 +27,7 @@
         <w:t xml:space="preserve"> </w:t>
       </w:r>
       <w:r>
-        <w:t xml:space="preserve">[to be filled: ORCID iD]</w:t>
+        <w:t xml:space="preserve">(https://orcid.org/0000-0003-2487-0636)</w:t>
       </w:r>
     </w:p>
     <w:p>
@@ -2926,7 +2926,7 @@
         <w:t xml:space="preserve">Zenodo: Conformome pilot release 0.1.0</w:t>
       </w:r>
       <w:r>
-        <w:t xml:space="preserve">. [to be filled: Zenodo DOI]</w:t>
+        <w:t xml:space="preserve">: conformational-state evidence records for proteins and nucleic acids. https://doi.org/10.5281/zenodo.23536810</w:t>
       </w:r>
     </w:p>
     <w:p>
@@ -3052,7 +3052,7 @@
         <w:pStyle w:val="BodyText"/>
       </w:pPr>
       <w:r>
-        <w:t xml:space="preserve">Data are available under the terms of the [to be filled: licence, e.g. Creative Commons Attribution 4.0 International license (CC-BY 4.0)].</w:t>
+        <w:t xml:space="preserve">Data are available under the terms of the Creative Commons Attribution 4.0 International license (CC-BY 4.0).</w:t>
       </w:r>
     </w:p>
     <w:p>

</xml_diff>